<commit_message>
Update week 02 worksheet materials
Co-Authored-By: Claude Sonnet 5 <noreply@anthropic.com>
</commit_message>
<xml_diff>
--- a/content/02-policy-process-streams/policy-window-worksheets.docx
+++ b/content/02-policy-process-streams/policy-window-worksheets.docx
@@ -137,7 +137,15 @@
       </w:r>
       <w:r>
         <w:lastRenderedPageBreak/>
-        <w:t>bar for a disciplined MSF analysis: name the streams, the coupling moment, and the entrepreneur — don’t just invoke the streams as background labels.</w:t>
+        <w:t xml:space="preserve">bar for a </w:t>
+      </w:r>
+      <w:proofErr w:type="spellStart"/>
+      <w:r>
+        <w:t>rigourous</w:t>
+      </w:r>
+      <w:proofErr w:type="spellEnd"/>
+      <w:r>
+        <w:t xml:space="preserve"> MSF analysis: name the streams, the coupling moment, and the entrepreneur — don’t just invoke the streams as background labels.</w:t>
       </w:r>
     </w:p>
     <w:p>
@@ -342,7 +350,15 @@
     </w:p>
     <w:p>
       <w:r>
-        <w:t>Coupling. Streams describe conditions; coupling describes action. Policy change happens when an entrepreneur joins the streams at an open window. Cairney &amp; Jones (2016) set the bar for a disciplined MSF analysis: name the streams, the coupling moment, and the entrepreneur — don’t just invoke the streams as background labels.</w:t>
+        <w:t xml:space="preserve">Coupling. Streams describe conditions; coupling describes action. Policy change happens when an entrepreneur joins the streams at an open window. Cairney &amp; Jones (2016) set the bar for a </w:t>
+      </w:r>
+      <w:proofErr w:type="spellStart"/>
+      <w:r>
+        <w:t>rigourous</w:t>
+      </w:r>
+      <w:proofErr w:type="spellEnd"/>
+      <w:r>
+        <w:t xml:space="preserve"> MSF analysis: name the streams, the coupling moment, and the entrepreneur — don’t just invoke the streams as background labels.</w:t>
       </w:r>
     </w:p>
     <w:p>
@@ -381,7 +397,13 @@
     </w:p>
     <w:p>
       <w:r>
-        <w:t>In 2025, after the 2024 election produced a change in the governing coalition, budget-reconciliation legislation partially withdrew the heat-pump credits. The same instrument was the subject of major legislative action twice within three years.</w:t>
+        <w:t xml:space="preserve">In 2025, after the 2024 election produced a change in the governing coalition, budget-reconciliation legislation </w:t>
+      </w:r>
+      <w:r>
+        <w:t xml:space="preserve">terminated </w:t>
+      </w:r>
+      <w:r>
+        <w:t>the heat-pump credits. The same instrument was the subject of major legislative action twice within three years.</w:t>
       </w:r>
     </w:p>
     <w:p>
@@ -558,7 +580,15 @@
     </w:p>
     <w:p>
       <w:r>
-        <w:t>Coupling. Streams describe conditions; coupling describes action. Policy change happens when an entrepreneur joins the streams at an open window. Cairney &amp; Jones (2016) set the bar for a disciplined MSF analysis: name the streams, the coupling moment, and the entrepreneur — don’t just invoke the streams as background labels.</w:t>
+        <w:t xml:space="preserve">Coupling. Streams describe conditions; coupling describes action. Policy change happens when an entrepreneur joins the streams at an open window. Cairney &amp; Jones (2016) set the bar for a </w:t>
+      </w:r>
+      <w:proofErr w:type="spellStart"/>
+      <w:r>
+        <w:t>rigourous</w:t>
+      </w:r>
+      <w:proofErr w:type="spellEnd"/>
+      <w:r>
+        <w:t xml:space="preserve"> MSF analysis: name the streams, the coupling moment, and the entrepreneur — don’t just invoke the streams as background labels.</w:t>
       </w:r>
     </w:p>
     <w:p>
@@ -774,7 +804,15 @@
     </w:p>
     <w:p>
       <w:r>
-        <w:t>Coupling. Streams describe conditions; coupling describes action. Policy change happens when an entrepreneur joins the streams at an open window. Cairney &amp; Jones (2016) set the bar for a disciplined MSF analysis: name the streams, the coupling moment, and the entrepreneur — don’t just invoke the streams as background labels.</w:t>
+        <w:t xml:space="preserve">Coupling. Streams describe conditions; coupling describes action. Policy change happens when an entrepreneur joins the streams at an open window. Cairney &amp; Jones (2016) set the bar for a </w:t>
+      </w:r>
+      <w:proofErr w:type="spellStart"/>
+      <w:r>
+        <w:t>rigourous</w:t>
+      </w:r>
+      <w:proofErr w:type="spellEnd"/>
+      <w:r>
+        <w:t xml:space="preserve"> MSF analysis: name the streams, the coupling moment, and the entrepreneur — don’t just invoke the streams as background labels.</w:t>
       </w:r>
     </w:p>
     <w:p>
@@ -812,8 +850,36 @@
       </w:r>
     </w:p>
     <w:p>
+      <w:pPr>
+        <w:rPr>
+          <w:lang w:val="en-IT"/>
+        </w:rPr>
+      </w:pPr>
       <w:r>
         <w:t>Unlike the Germany and US cases, no single minister or ad hoc political coalition is centrally associated with MaPrimeRénov’; ANAH is a standing technical agency that has been involved continuously across all three redesigns.</w:t>
+      </w:r>
+      <w:r>
+        <w:t xml:space="preserve"> The scheme was then</w:t>
+      </w:r>
+      <w:r>
+        <w:rPr>
+          <w:b/>
+          <w:bCs/>
+          <w:lang w:val="en-IT"/>
+        </w:rPr>
+        <w:t xml:space="preserve"> </w:t>
+      </w:r>
+      <w:r>
+        <w:rPr>
+          <w:lang w:val="en-IT"/>
+        </w:rPr>
+        <w:t>suspended January 2026 pending the budget, reopening in reduced form from February 2026</w:t>
+      </w:r>
+      <w:r>
+        <w:rPr>
+          <w:lang w:val="en-IT"/>
+        </w:rPr>
+        <w:t>.</w:t>
       </w:r>
     </w:p>
     <w:p>
@@ -990,7 +1056,13 @@
     </w:p>
     <w:p>
       <w:r>
-        <w:t>Coupling. Streams describe conditions; coupling describes action. Policy change happens when an entrepreneur joins the streams at an open window. Cairney &amp; Jones (2016) set the bar for a disciplined MSF analysis: name the streams, the coupling moment, and the entrepreneur — don’t just invoke the streams as background labels.</w:t>
+        <w:t xml:space="preserve">Coupling. Streams describe conditions; coupling describes action. Policy change happens when an entrepreneur joins the streams at an open window. Cairney &amp; Jones (2016) set the bar for a </w:t>
+      </w:r>
+      <w:r>
+        <w:t xml:space="preserve">rigorous </w:t>
+      </w:r>
+      <w:r>
+        <w:t>MSF analysis: name the streams, the coupling moment, and the entrepreneur — don’t just invoke the streams as background labels.</w:t>
       </w:r>
     </w:p>
     <w:p>
@@ -1193,7 +1265,15 @@
     </w:p>
     <w:p>
       <w:r>
-        <w:t>Coupling. Streams describe conditions; coupling describes action. Policy change happens when an entrepreneur joins the streams at an open window. Cairney &amp; Jones (2016) set the bar for a disciplined MSF analysis: name the streams, the coupling moment, and the entrepreneur — don’t just invoke the streams as background labels.</w:t>
+        <w:t xml:space="preserve">Coupling. Streams describe conditions; coupling describes action. Policy change happens when an entrepreneur joins the streams at an open window. Cairney &amp; Jones (2016) set the bar for a </w:t>
+      </w:r>
+      <w:proofErr w:type="spellStart"/>
+      <w:r>
+        <w:t>rigourous</w:t>
+      </w:r>
+      <w:proofErr w:type="spellEnd"/>
+      <w:r>
+        <w:t xml:space="preserve"> MSF analysis: name the streams, the coupling moment, and the entrepreneur — don’t just invoke the streams as background labels.</w:t>
       </w:r>
     </w:p>
     <w:p>
@@ -2075,7 +2155,6 @@
   <w:style w:type="character" w:default="1" w:styleId="DefaultParagraphFont">
     <w:name w:val="Default Paragraph Font"/>
     <w:uiPriority w:val="1"/>
-    <w:semiHidden/>
     <w:unhideWhenUsed/>
   </w:style>
   <w:style w:type="table" w:default="1" w:styleId="TableNormal">
@@ -12851,6 +12930,19 @@
         <w:shd w:val="clear" w:color="auto" w:fill="FBCAA2" w:themeFill="accent6" w:themeFillTint="7F"/>
       </w:tcPr>
     </w:tblStylePr>
+  </w:style>
+  <w:style w:type="paragraph" w:styleId="NormalWeb">
+    <w:name w:val="Normal (Web)"/>
+    <w:basedOn w:val="Normal"/>
+    <w:uiPriority w:val="99"/>
+    <w:semiHidden/>
+    <w:unhideWhenUsed/>
+    <w:rsid w:val="00AB0208"/>
+    <w:rPr>
+      <w:rFonts w:ascii="Times New Roman" w:hAnsi="Times New Roman" w:cs="Times New Roman"/>
+      <w:sz w:val="24"/>
+      <w:szCs w:val="24"/>
+    </w:rPr>
   </w:style>
 </w:styles>
 </file>

</xml_diff>